<commit_message>
Procesevaluatie afgewerkt (eCRF 39-44, alle kopieen) en deck procesevaluatie + gezondheidseconomie
eCRF 39 (protocol van Maaike Fobelets) inhoudelijk ongewijzigd: titel en opmerkingen. Dagboek 40
vervolledigd zoals REDCap, invullen na elke sessie volgens eCRF 39; gidsen 41-43 met de duur uit de
toestemmingsformulieren, restanten uit een ander studieprotocol geschrapt, slotvragen; fidelity 44 met
deelnemerscode en voorstel totaalscore. Alles als bijgehouden wijzigingen met opmerkingen voor Maaike.
Nieuw deck PARADISE_procesevaluatie_gezondheidseconomie.pptx (16 dia's, zoom via morph, notities).

Co-Authored-By: Claude Opus 5.5 <noreply@anthropic.com>
</commit_message>
<xml_diff>
--- a/(e)CRF/Per nummer/39_Protocol procesevaluatie.docx
+++ b/(e)CRF/Per nummer/39_Protocol procesevaluatie.docx
@@ -2,6 +2,24 @@
 <file path=word/document.xml><?xml version="1.0" encoding="utf-8"?>
 <w:document xmlns:wpc="http://schemas.microsoft.com/office/word/2010/wordprocessingCanvas" xmlns:cx="http://schemas.microsoft.com/office/drawing/2014/chartex" xmlns:cx1="http://schemas.microsoft.com/office/drawing/2015/9/8/chartex" xmlns:cx2="http://schemas.microsoft.com/office/drawing/2015/10/21/chartex" xmlns:cx3="http://schemas.microsoft.com/office/drawing/2016/5/9/chartex" xmlns:cx4="http://schemas.microsoft.com/office/drawing/2016/5/10/chartex" xmlns:cx5="http://schemas.microsoft.com/office/drawing/2016/5/11/chartex" xmlns:cx6="http://schemas.microsoft.com/office/drawing/2016/5/12/chartex" xmlns:cx7="http://schemas.microsoft.com/office/drawing/2016/5/13/chartex" xmlns:cx8="http://schemas.microsoft.com/office/drawing/2016/5/14/chartex" xmlns:mc="http://schemas.openxmlformats.org/markup-compatibility/2006" xmlns:aink="http://schemas.microsoft.com/office/drawing/2016/ink" xmlns:am3d="http://schemas.microsoft.com/office/drawing/2017/model3d" xmlns:o="urn:schemas-microsoft-com:office:office" xmlns:oel="http://schemas.microsoft.com/office/2019/extlst" xmlns:r="http://schemas.openxmlformats.org/officeDocument/2006/relationships" xmlns:m="http://schemas.openxmlformats.org/officeDocument/2006/math" xmlns:v="urn:schemas-microsoft-com:vml" xmlns:wp14="http://schemas.microsoft.com/office/word/2010/wordprocessingDrawing" xmlns:wp="http://schemas.openxmlformats.org/drawingml/2006/wordprocessingDrawing" xmlns:w10="urn:schemas-microsoft-com:office:word" xmlns:w="http://schemas.openxmlformats.org/wordprocessingml/2006/main" xmlns:w14="http://schemas.microsoft.com/office/word/2010/wordml" xmlns:w15="http://schemas.microsoft.com/office/word/2012/wordml" xmlns:w16cex="http://schemas.microsoft.com/office/word/2018/wordml/cex" xmlns:w16cid="http://schemas.microsoft.com/office/word/2016/wordml/cid" xmlns:w16="http://schemas.microsoft.com/office/word/2018/wordml" xmlns:w16du="http://schemas.microsoft.com/office/word/2023/wordml/word16du" xmlns:w16sdtdh="http://schemas.microsoft.com/office/word/2020/wordml/sdtdatahash" xmlns:w16sdtfl="http://schemas.microsoft.com/office/word/2024/wordml/sdtformatlock" xmlns:w16se="http://schemas.microsoft.com/office/word/2015/wordml/symex" xmlns:wpg="http://schemas.microsoft.com/office/word/2010/wordprocessingGroup" xmlns:wpi="http://schemas.microsoft.com/office/word/2010/wordprocessingInk" xmlns:wne="http://schemas.microsoft.com/office/word/2006/wordml" xmlns:wps="http://schemas.microsoft.com/office/word/2010/wordprocessingShape" mc:Ignorable="w14 w15 w16se w16cid w16 w16cex w16sdtdh w16sdtfl w16du wp14">
   <w:body>
+    <w:p>
+      <w:pPr>
+        <w:jc w:val="center"/>
+        <w:rPr>
+          <w:ins w:id="1000" w:author="Janou De Buyser" w:date="2026-10-25T10:00:00Z"/>
+        </w:rPr>
+      </w:pPr>
+      <w:ins w:id="1001" w:author="Janou De Buyser" w:date="2026-10-25T10:00:00Z">
+        <w:r>
+          <w:rPr>
+            <w:b/>
+            <w:color w:val="123A5F"/>
+            <w:sz w:val="28"/>
+          </w:rPr>
+          <w:t xml:space="preserve">Appendix 39: Process Evaluation Protocol</w:t>
+        </w:r>
+      </w:ins>
+    </w:p>
     <w:tbl>
       <w:tblPr>
         <w:tblStyle w:val="TableGrid"/>
@@ -38,6 +56,7 @@
                 <w:lang w:val="en-GB"/>
               </w:rPr>
             </w:pPr>
+            <w:commentRangeStart w:id="0"/>
             <w:r>
               <w:rPr>
                 <w:rFonts w:ascii="Arial" w:hAnsi="Arial" w:eastAsia="Arial" w:cs="Arial"/>
@@ -48,6 +67,13 @@
                 <w:lang w:val="en-GB"/>
               </w:rPr>
               <w:t xml:space="preserve">Dimension and subdimension </w:t>
+            </w:r>
+            <w:commentRangeEnd w:id="0"/>
+            <w:r>
+              <w:rPr>
+                <w:rStyle w:val="CommentReference"/>
+              </w:rPr>
+              <w:commentReference w:id="0"/>
             </w:r>
           </w:p>
         </w:tc>
@@ -231,6 +257,7 @@
                 <w:lang w:val="en-GB"/>
               </w:rPr>
             </w:pPr>
+            <w:commentRangeStart w:id="1"/>
             <w:r>
               <w:rPr>
                 <w:rFonts w:ascii="Arial" w:hAnsi="Arial" w:eastAsia="Arial" w:cs="Arial"/>
@@ -242,6 +269,13 @@
                 <w:lang w:val="en-GB"/>
               </w:rPr>
               <w:t>Implementation</w:t>
+            </w:r>
+            <w:commentRangeEnd w:id="1"/>
+            <w:r>
+              <w:rPr>
+                <w:rStyle w:val="CommentReference"/>
+              </w:rPr>
+              <w:commentReference w:id="1"/>
             </w:r>
           </w:p>
         </w:tc>
@@ -1150,6 +1184,7 @@
                 <w:lang w:val="en-GB"/>
               </w:rPr>
             </w:pPr>
+            <w:commentRangeStart w:id="2"/>
             <w:r>
               <w:rPr>
                 <w:rFonts w:ascii="Arial" w:hAnsi="Arial" w:eastAsia="Arial" w:cs="Arial"/>
@@ -1221,6 +1256,13 @@
                 <w:lang w:val="en-GB"/>
               </w:rPr>
               <w:t>(selection based on randomisation)</w:t>
+            </w:r>
+            <w:commentRangeEnd w:id="2"/>
+            <w:r>
+              <w:rPr>
+                <w:rStyle w:val="CommentReference"/>
+              </w:rPr>
+              <w:commentReference w:id="2"/>
             </w:r>
           </w:p>
           <w:p>
@@ -7360,6 +7402,59 @@
     </w:sectPr>
   </w:body>
 </w:document>
+</file>
+
+<file path=word/comments.xml><?xml version="1.0" encoding="utf-8"?>
+<w:comments xmlns:a="http://schemas.openxmlformats.org/drawingml/2006/main" xmlns:pic="http://schemas.openxmlformats.org/drawingml/2006/picture" xmlns:r="http://schemas.openxmlformats.org/officeDocument/2006/relationships" xmlns:w="http://schemas.openxmlformats.org/wordprocessingml/2006/main" xmlns:wp="http://schemas.openxmlformats.org/drawingml/2006/wordprocessingDrawing" xmlns:mc="http://schemas.openxmlformats.org/markup-compatibility/2006" xmlns:a14="http://schemas.microsoft.com/office/drawing/2010/main" xmlns:w14="http://schemas.microsoft.com/office/word/2010/wordml" xmlns:wpc="http://schemas.microsoft.com/office/word/2010/wordprocessingCanvas">
+  <w:comment w:id="0" w:author="Janou De Buyser" w:initials="JDB" w:date="2026-10-25T18:00:01Z">
+    <w:p>
+      <w:pPr>
+        <w:pStyle w:val="CommentText"/>
+      </w:pPr>
+      <w:r>
+        <w:rPr>
+          <w:rStyle w:val="CommentReference"/>
+        </w:rPr>
+        <w:annotationRef/>
+      </w:r>
+      <w:r>
+        <w:t>Koppeling met de formulieren in de set: gestructureerd dagboek = eCRF 40; interviewgidsen = eCRF 41 (patiënt), 42 (therapeut) en 43 (management); fidelity = eCRF 44; logboek educatie = eCRF 18; screening = eCRF 00 en 01; adverse events = eCRF 46. Twee aanvullingen om te overwegen: de interviews met managers (eCRF 43) hebben nog geen rij in deze tabel, en het nieuwe eCRF 49 registreert op elke visite het start- en einduur van podoloog en verpleegkundige, in beide armen (mogelijke bron voor 1B, I3).</w:t>
+      </w:r>
+    </w:p>
+  </w:comment>
+  <w:comment w:id="1" w:author="Janou De Buyser" w:initials="JDB" w:date="2026-10-25T18:00:01Z">
+    <w:p>
+      <w:pPr>
+        <w:pStyle w:val="CommentText"/>
+      </w:pPr>
+      <w:r>
+        <w:rPr>
+          <w:rStyle w:val="CommentReference"/>
+        </w:rPr>
+        <w:annotationRef/>
+      </w:r>
+      <w:r>
+        <w:t>Usual Care komt in dit protocol niet voor. Het toestemmingsformulier therapeut (eCRF 04) vermeldt een evaluatie van de gebruikelijke zorg, en het manuscript zegt dat de interviews over beide armen gespreid worden. Voegen we een Usual Care-component toe (gebruikelijke zorg beschrijven, contaminatie opvolgen), of interviewen we alleen in Optimal Care?</w:t>
+      </w:r>
+    </w:p>
+  </w:comment>
+  <w:comment w:id="2" w:author="Janou De Buyser" w:initials="JDB" w:date="2026-10-25T18:00:01Z">
+    <w:p>
+      <w:pPr>
+        <w:pStyle w:val="CommentText"/>
+      </w:pPr>
+      <w:r>
+        <w:rPr>
+          <w:rStyle w:val="CommentReference"/>
+        </w:rPr>
+        <w:annotationRef/>
+      </w:r>
+      <w:r>
+        <w:t>Opnames: de andere documenten volgen dit protocol (twee sessies per patiënt, video). Het manuscript spreekt nog van "a sample of sessions audio-recorded or observed" en moet hieraan aangepast worden. Het toestemmingsformulier van de patiënt (eCRF 02) vraagt voor opnames een afzonderlijke toestemming; dat formulier zit nog niet in de set.</w:t>
+      </w:r>
+    </w:p>
+  </w:comment>
+</w:comments>
 </file>
 
 <file path=word/endnotes.xml><?xml version="1.0" encoding="utf-8"?>

</xml_diff>

<commit_message>
Procesevaluatie tweede controle: taal en consistentie in eCRF 40-44, deck rechtgezet
Opnieuw opgebouwd vanaf de originelen, alles als bijgehouden wijzigingen: gidsen 41-43 overal in u,
inleiding en openingsvragen van de managementgids afgestemd op managers, titels in het Nederlands,
ziekenhuisnamen (UZ Gent, AZORG), labels (k)/(n)/(o), taalfouten; voettekst 41 patient -> patient
met trema; fidelity 44 met protocolnummer, Visitenummer, ulcuspreventie; eCRF 39 alleen opmerkingen
(nieuw: kleine tekstpunten en timing interviews). Deck: titel interviews, term therapeuten, volgorde
deel 1, inhoud hoofdstukdia's, matrix (eCRF 41 en 42), notities.

Co-Authored-By: Claude Opus 5.5 <noreply@anthropic.com>
</commit_message>
<xml_diff>
--- a/(e)CRF/Per nummer/39_Protocol procesevaluatie.docx
+++ b/(e)CRF/Per nummer/39_Protocol procesevaluatie.docx
@@ -6,10 +6,10 @@
       <w:pPr>
         <w:jc w:val="center"/>
         <w:rPr>
-          <w:ins w:id="1000" w:author="Janou De Buyser" w:date="2026-10-25T10:00:00Z"/>
+          <w:ins w:id="1000" w:author="Janou De Buyser" w:date="2026-10-26T10:00:00Z"/>
         </w:rPr>
       </w:pPr>
-      <w:ins w:id="1001" w:author="Janou De Buyser" w:date="2026-10-25T10:00:00Z">
+      <w:ins w:id="1001" w:author="Janou De Buyser" w:date="2026-10-26T10:00:00Z">
         <w:r>
           <w:rPr>
             <w:b/>
@@ -3122,6 +3122,7 @@
                 <w:lang w:val="en-GB"/>
               </w:rPr>
             </w:pPr>
+            <w:commentRangeStart w:id="3"/>
             <w:r>
               <w:rPr>
                 <w:rFonts w:ascii="Arial" w:hAnsi="Arial" w:eastAsia="Arial" w:cs="Arial"/>
@@ -3216,6 +3217,13 @@
                 <w:lang w:val="en-GB"/>
               </w:rPr>
               <w:t>eCRF</w:t>
+            </w:r>
+            <w:commentRangeEnd w:id="3"/>
+            <w:r>
+              <w:rPr>
+                <w:rStyle w:val="CommentReference"/>
+              </w:rPr>
+              <w:commentReference w:id="3"/>
             </w:r>
           </w:p>
         </w:tc>
@@ -7406,7 +7414,7 @@
 
 <file path=word/comments.xml><?xml version="1.0" encoding="utf-8"?>
 <w:comments xmlns:a="http://schemas.openxmlformats.org/drawingml/2006/main" xmlns:pic="http://schemas.openxmlformats.org/drawingml/2006/picture" xmlns:r="http://schemas.openxmlformats.org/officeDocument/2006/relationships" xmlns:w="http://schemas.openxmlformats.org/wordprocessingml/2006/main" xmlns:wp="http://schemas.openxmlformats.org/drawingml/2006/wordprocessingDrawing" xmlns:mc="http://schemas.openxmlformats.org/markup-compatibility/2006" xmlns:a14="http://schemas.microsoft.com/office/drawing/2010/main" xmlns:w14="http://schemas.microsoft.com/office/word/2010/wordml" xmlns:wpc="http://schemas.microsoft.com/office/word/2010/wordprocessingCanvas">
-  <w:comment w:id="0" w:author="Janou De Buyser" w:initials="JDB" w:date="2026-10-25T18:00:01Z">
+  <w:comment w:id="0" w:author="Janou De Buyser" w:initials="JDB" w:date="2026-10-26T06:44:28Z">
     <w:p>
       <w:pPr>
         <w:pStyle w:val="CommentText"/>
@@ -7422,7 +7430,7 @@
       </w:r>
     </w:p>
   </w:comment>
-  <w:comment w:id="1" w:author="Janou De Buyser" w:initials="JDB" w:date="2026-10-25T18:00:01Z">
+  <w:comment w:id="1" w:author="Janou De Buyser" w:initials="JDB" w:date="2026-10-26T06:44:28Z">
     <w:p>
       <w:pPr>
         <w:pStyle w:val="CommentText"/>
@@ -7438,7 +7446,7 @@
       </w:r>
     </w:p>
   </w:comment>
-  <w:comment w:id="2" w:author="Janou De Buyser" w:initials="JDB" w:date="2026-10-25T18:00:01Z">
+  <w:comment w:id="2" w:author="Janou De Buyser" w:initials="JDB" w:date="2026-10-26T06:44:28Z">
     <w:p>
       <w:pPr>
         <w:pStyle w:val="CommentText"/>
@@ -7451,6 +7459,22 @@
       </w:r>
       <w:r>
         <w:t>Opnames: de andere documenten volgen dit protocol (twee sessies per patiënt, video). Het manuscript spreekt nog van "a sample of sessions audio-recorded or observed" en moet hieraan aangepast worden. Het toestemmingsformulier van de patiënt (eCRF 02) vraagt voor opnames een afzonderlijke toestemming; dat formulier zit nog niet in de set.</w:t>
+      </w:r>
+    </w:p>
+  </w:comment>
+  <w:comment w:id="3" w:author="Janou De Buyser" w:initials="JDB" w:date="2026-10-26T06:44:28Z">
+    <w:p>
+      <w:pPr>
+        <w:pStyle w:val="CommentText"/>
+      </w:pPr>
+      <w:r>
+        <w:rPr>
+          <w:rStyle w:val="CommentReference"/>
+        </w:rPr>
+        <w:annotationRef/>
+      </w:r>
+      <w:r>
+        <w:t>Kleine tekstpunten, ter controle: (f) heeft alleen een I1, dus wellicht "To measure I1"; bij (k) en (m1) ontbreekt "session" na "the last PARADISE"; "(d)Throughout" mist een spatie; de letters springen van (o) naar (q). De interviews met zorgverleners staan bij (a2), (g2), (l) en (m2) op "every 6 months", bij (n2), (o2) en (q) op "after 12 months": welke timing geldt?</w:t>
       </w:r>
     </w:p>
   </w:comment>

</xml_diff>

<commit_message>
eCRF 39 (protocol procesevaluatie Maaike): opmerkingen verwijderd in alle kopieen; alleen de titelwijziging blijft
Co-Authored-By: Claude Opus 5.5 <noreply@anthropic.com>
</commit_message>
<xml_diff>
--- a/(e)CRF/Per nummer/39_Protocol procesevaluatie.docx
+++ b/(e)CRF/Per nummer/39_Protocol procesevaluatie.docx
@@ -56,7 +56,6 @@
                 <w:lang w:val="en-GB"/>
               </w:rPr>
             </w:pPr>
-            <w:commentRangeStart w:id="0"/>
             <w:r>
               <w:rPr>
                 <w:rFonts w:ascii="Arial" w:hAnsi="Arial" w:eastAsia="Arial" w:cs="Arial"/>
@@ -67,13 +66,6 @@
                 <w:lang w:val="en-GB"/>
               </w:rPr>
               <w:t xml:space="preserve">Dimension and subdimension </w:t>
-            </w:r>
-            <w:commentRangeEnd w:id="0"/>
-            <w:r>
-              <w:rPr>
-                <w:rStyle w:val="CommentReference"/>
-              </w:rPr>
-              <w:commentReference w:id="0"/>
             </w:r>
           </w:p>
         </w:tc>
@@ -257,7 +249,6 @@
                 <w:lang w:val="en-GB"/>
               </w:rPr>
             </w:pPr>
-            <w:commentRangeStart w:id="1"/>
             <w:r>
               <w:rPr>
                 <w:rFonts w:ascii="Arial" w:hAnsi="Arial" w:eastAsia="Arial" w:cs="Arial"/>
@@ -269,13 +260,6 @@
                 <w:lang w:val="en-GB"/>
               </w:rPr>
               <w:t>Implementation</w:t>
-            </w:r>
-            <w:commentRangeEnd w:id="1"/>
-            <w:r>
-              <w:rPr>
-                <w:rStyle w:val="CommentReference"/>
-              </w:rPr>
-              <w:commentReference w:id="1"/>
             </w:r>
           </w:p>
         </w:tc>
@@ -1184,7 +1168,6 @@
                 <w:lang w:val="en-GB"/>
               </w:rPr>
             </w:pPr>
-            <w:commentRangeStart w:id="2"/>
             <w:r>
               <w:rPr>
                 <w:rFonts w:ascii="Arial" w:hAnsi="Arial" w:eastAsia="Arial" w:cs="Arial"/>
@@ -1256,13 +1239,6 @@
                 <w:lang w:val="en-GB"/>
               </w:rPr>
               <w:t>(selection based on randomisation)</w:t>
-            </w:r>
-            <w:commentRangeEnd w:id="2"/>
-            <w:r>
-              <w:rPr>
-                <w:rStyle w:val="CommentReference"/>
-              </w:rPr>
-              <w:commentReference w:id="2"/>
             </w:r>
           </w:p>
           <w:p>
@@ -3122,7 +3098,6 @@
                 <w:lang w:val="en-GB"/>
               </w:rPr>
             </w:pPr>
-            <w:commentRangeStart w:id="3"/>
             <w:r>
               <w:rPr>
                 <w:rFonts w:ascii="Arial" w:hAnsi="Arial" w:eastAsia="Arial" w:cs="Arial"/>
@@ -3217,13 +3192,6 @@
                 <w:lang w:val="en-GB"/>
               </w:rPr>
               <w:t>eCRF</w:t>
-            </w:r>
-            <w:commentRangeEnd w:id="3"/>
-            <w:r>
-              <w:rPr>
-                <w:rStyle w:val="CommentReference"/>
-              </w:rPr>
-              <w:commentReference w:id="3"/>
             </w:r>
           </w:p>
         </w:tc>
@@ -7410,75 +7378,6 @@
     </w:sectPr>
   </w:body>
 </w:document>
-</file>
-
-<file path=word/comments.xml><?xml version="1.0" encoding="utf-8"?>
-<w:comments xmlns:a="http://schemas.openxmlformats.org/drawingml/2006/main" xmlns:pic="http://schemas.openxmlformats.org/drawingml/2006/picture" xmlns:r="http://schemas.openxmlformats.org/officeDocument/2006/relationships" xmlns:w="http://schemas.openxmlformats.org/wordprocessingml/2006/main" xmlns:wp="http://schemas.openxmlformats.org/drawingml/2006/wordprocessingDrawing" xmlns:mc="http://schemas.openxmlformats.org/markup-compatibility/2006" xmlns:a14="http://schemas.microsoft.com/office/drawing/2010/main" xmlns:w14="http://schemas.microsoft.com/office/word/2010/wordml" xmlns:wpc="http://schemas.microsoft.com/office/word/2010/wordprocessingCanvas">
-  <w:comment w:id="0" w:author="Janou De Buyser" w:initials="JDB" w:date="2026-10-26T06:44:28Z">
-    <w:p>
-      <w:pPr>
-        <w:pStyle w:val="CommentText"/>
-      </w:pPr>
-      <w:r>
-        <w:rPr>
-          <w:rStyle w:val="CommentReference"/>
-        </w:rPr>
-        <w:annotationRef/>
-      </w:r>
-      <w:r>
-        <w:t>Koppeling met de formulieren in de set: gestructureerd dagboek = eCRF 40; interviewgidsen = eCRF 41 (patiënt), 42 (therapeut) en 43 (management); fidelity = eCRF 44; logboek educatie = eCRF 18; screening = eCRF 00 en 01; adverse events = eCRF 46. Twee aanvullingen om te overwegen: de interviews met managers (eCRF 43) hebben nog geen rij in deze tabel, en het nieuwe eCRF 49 registreert op elke visite het start- en einduur van podoloog en verpleegkundige, in beide armen (mogelijke bron voor 1B, I3).</w:t>
-      </w:r>
-    </w:p>
-  </w:comment>
-  <w:comment w:id="1" w:author="Janou De Buyser" w:initials="JDB" w:date="2026-10-26T06:44:28Z">
-    <w:p>
-      <w:pPr>
-        <w:pStyle w:val="CommentText"/>
-      </w:pPr>
-      <w:r>
-        <w:rPr>
-          <w:rStyle w:val="CommentReference"/>
-        </w:rPr>
-        <w:annotationRef/>
-      </w:r>
-      <w:r>
-        <w:t>Usual Care komt in dit protocol niet voor. Het toestemmingsformulier therapeut (eCRF 04) vermeldt een evaluatie van de gebruikelijke zorg, en het manuscript zegt dat de interviews over beide armen gespreid worden. Voegen we een Usual Care-component toe (gebruikelijke zorg beschrijven, contaminatie opvolgen), of interviewen we alleen in Optimal Care?</w:t>
-      </w:r>
-    </w:p>
-  </w:comment>
-  <w:comment w:id="2" w:author="Janou De Buyser" w:initials="JDB" w:date="2026-10-26T06:44:28Z">
-    <w:p>
-      <w:pPr>
-        <w:pStyle w:val="CommentText"/>
-      </w:pPr>
-      <w:r>
-        <w:rPr>
-          <w:rStyle w:val="CommentReference"/>
-        </w:rPr>
-        <w:annotationRef/>
-      </w:r>
-      <w:r>
-        <w:t>Opnames: de andere documenten volgen dit protocol (twee sessies per patiënt, video). Het manuscript spreekt nog van "a sample of sessions audio-recorded or observed" en moet hieraan aangepast worden. Het toestemmingsformulier van de patiënt (eCRF 02) vraagt voor opnames een afzonderlijke toestemming; dat formulier zit nog niet in de set.</w:t>
-      </w:r>
-    </w:p>
-  </w:comment>
-  <w:comment w:id="3" w:author="Janou De Buyser" w:initials="JDB" w:date="2026-10-26T06:44:28Z">
-    <w:p>
-      <w:pPr>
-        <w:pStyle w:val="CommentText"/>
-      </w:pPr>
-      <w:r>
-        <w:rPr>
-          <w:rStyle w:val="CommentReference"/>
-        </w:rPr>
-        <w:annotationRef/>
-      </w:r>
-      <w:r>
-        <w:t>Kleine tekstpunten, ter controle: (f) heeft alleen een I1, dus wellicht "To measure I1"; bij (k) en (m1) ontbreekt "session" na "the last PARADISE"; "(d)Throughout" mist een spatie; de letters springen van (o) naar (q). De interviews met zorgverleners staan bij (a2), (g2), (l) en (m2) op "every 6 months", bij (n2), (o2) en (q) op "after 12 months": welke timing geldt?</w:t>
-      </w:r>
-    </w:p>
-  </w:comment>
-</w:comments>
 </file>
 
 <file path=word/endnotes.xml><?xml version="1.0" encoding="utf-8"?>

</xml_diff>